<commit_message>
Update CACIF-DI (fixing version register)
</commit_message>
<xml_diff>
--- a/Desarrollo/CACIF/Diseño/CACIF-DI.docx
+++ b/Desarrollo/CACIF/Diseño/CACIF-DI.docx
@@ -744,8 +744,12 @@
             </w:pPr>
             <w:r>
               <w:rPr>
-                <w:rtl w:val="0"/>
-              </w:rPr>
+                <w:rFonts w:ascii="Times New Roman" w:cs="Times New Roman" w:eastAsia="Times New Roman" w:hAnsi="Times New Roman"/>
+                <w:sz w:val="20"/>
+                <w:szCs w:val="20"/>
+                <w:rtl w:val="0"/>
+              </w:rPr>
+              <w:t xml:space="preserve">17/05/2026</w:t>
             </w:r>
           </w:p>
         </w:tc>
@@ -772,8 +776,12 @@
             </w:pPr>
             <w:r>
               <w:rPr>
-                <w:rtl w:val="0"/>
-              </w:rPr>
+                <w:rFonts w:ascii="Times New Roman" w:cs="Times New Roman" w:eastAsia="Times New Roman" w:hAnsi="Times New Roman"/>
+                <w:sz w:val="20"/>
+                <w:szCs w:val="20"/>
+                <w:rtl w:val="0"/>
+              </w:rPr>
+              <w:t xml:space="preserve">1.2</w:t>
             </w:r>
           </w:p>
         </w:tc>
@@ -800,8 +808,12 @@
             </w:pPr>
             <w:r>
               <w:rPr>
-                <w:rtl w:val="0"/>
-              </w:rPr>
+                <w:rFonts w:ascii="Times New Roman" w:cs="Times New Roman" w:eastAsia="Times New Roman" w:hAnsi="Times New Roman"/>
+                <w:sz w:val="20"/>
+                <w:szCs w:val="20"/>
+                <w:rtl w:val="0"/>
+              </w:rPr>
+              <w:t xml:space="preserve">Actualizacion de paleta de colores y capturas de pantalla</w:t>
             </w:r>
           </w:p>
         </w:tc>
@@ -828,8 +840,12 @@
             </w:pPr>
             <w:r>
               <w:rPr>
-                <w:rtl w:val="0"/>
-              </w:rPr>
+                <w:rFonts w:ascii="Times New Roman" w:cs="Times New Roman" w:eastAsia="Times New Roman" w:hAnsi="Times New Roman"/>
+                <w:sz w:val="20"/>
+                <w:szCs w:val="20"/>
+                <w:rtl w:val="0"/>
+              </w:rPr>
+              <w:t xml:space="preserve">Mihael Cristobal</w:t>
             </w:r>
           </w:p>
         </w:tc>
@@ -1238,7 +1254,7 @@
     </w:p>
     <w:sdt>
       <w:sdtPr>
-        <w:id w:val="139450570"/>
+        <w:id w:val="333701085"/>
         <w:docPartObj>
           <w:docPartGallery w:val="Table of Contents"/>
           <w:docPartUnique w:val="1"/>
@@ -8183,12 +8199,12 @@
           <wp:inline distB="114300" distT="114300" distL="114300" distR="114300">
             <wp:extent cx="4866052" cy="2643188"/>
             <wp:effectExtent b="0" l="0" r="0" t="0"/>
-            <wp:docPr id="6" name="image3.png"/>
+            <wp:docPr id="6" name="image6.png"/>
             <a:graphic>
               <a:graphicData uri="http://schemas.openxmlformats.org/drawingml/2006/picture">
                 <pic:pic>
                   <pic:nvPicPr>
-                    <pic:cNvPr id="0" name="image3.png"/>
+                    <pic:cNvPr id="0" name="image6.png"/>
                     <pic:cNvPicPr preferRelativeResize="0"/>
                   </pic:nvPicPr>
                   <pic:blipFill>
@@ -8361,12 +8377,12 @@
           <wp:inline distB="114300" distT="114300" distL="114300" distR="114300">
             <wp:extent cx="4880988" cy="2691840"/>
             <wp:effectExtent b="0" l="0" r="0" t="0"/>
-            <wp:docPr id="1" name="image6.png"/>
+            <wp:docPr id="1" name="image3.png"/>
             <a:graphic>
               <a:graphicData uri="http://schemas.openxmlformats.org/drawingml/2006/picture">
                 <pic:pic>
                   <pic:nvPicPr>
-                    <pic:cNvPr id="0" name="image6.png"/>
+                    <pic:cNvPr id="0" name="image3.png"/>
                     <pic:cNvPicPr preferRelativeResize="0"/>
                   </pic:nvPicPr>
                   <pic:blipFill>

</xml_diff>